<commit_message>
Revisión: decisión por requisitos imprescindibles, comprobaciones de cálculo, listas de ilustraciones y tablas
Co-Authored-By: Claude Opus 5.5 <noreply@anthropic.com>
Claude-Session: https://claude.ai/code/session_01GULK22xqK1fWX4r8uc4cx1
</commit_message>
<xml_diff>
--- a/trabajo/Dudas_y_decisiones.docx
+++ b/trabajo/Dudas_y_decisiones.docx
@@ -175,14 +175,14 @@
               <w:rPr>
                 <w:sz w:val="19"/>
               </w:rPr>
-              <w:t>El ACV está en kg de CO₂ equivalente, no en Ecopuntos (ECO-it) (1. Enfoque general)</w:t>
+              <w:t>Decisión final: aluminio reciclado (antes era la madera) (4.5)</w:t>
             </w:r>
           </w:p>
         </w:tc>
         <w:tc>
           <w:tcPr>
             <w:tcW w:type="dxa" w:w="1134"/>
-            <w:shd w:val="clear" w:color="auto" w:fill="C0392B"/>
+            <w:shd w:val="clear" w:color="auto" w:fill="D68910"/>
           </w:tcPr>
           <w:p>
             <w:r>
@@ -195,7 +195,7 @@
               <w:rPr>
                 <w:sz w:val="19"/>
               </w:rPr>
-              <w:t>Alto</w:t>
+              <w:t>Medio</w:t>
             </w:r>
           </w:p>
         </w:tc>
@@ -225,14 +225,14 @@
               <w:rPr>
                 <w:sz w:val="19"/>
               </w:rPr>
-              <w:t>La alternativa de madera usa la misma geometría que la metálica (4. Evaluación)</w:t>
+              <w:t>Comprobaciones por cálculo manual (3.5)</w:t>
             </w:r>
           </w:p>
         </w:tc>
         <w:tc>
           <w:tcPr>
             <w:tcW w:type="dxa" w:w="1134"/>
-            <w:shd w:val="clear" w:color="auto" w:fill="C0392B"/>
+            <w:shd w:val="clear" w:color="auto" w:fill="D68910"/>
           </w:tcPr>
           <w:p>
             <w:r>
@@ -245,7 +245,7 @@
               <w:rPr>
                 <w:sz w:val="19"/>
               </w:rPr>
-              <w:t>Alto</w:t>
+              <w:t>Medio</w:t>
             </w:r>
           </w:p>
         </w:tc>
@@ -275,14 +275,14 @@
               <w:rPr>
                 <w:sz w:val="19"/>
               </w:rPr>
-              <w:t>El taburete modelado no tiene ningún bloqueo en posición abierta (3.4 y 5.2)</w:t>
+              <w:t>El pestillo está dimensionado pero no modelado (3.5 y 5.2)</w:t>
             </w:r>
           </w:p>
         </w:tc>
         <w:tc>
           <w:tcPr>
             <w:tcW w:type="dxa" w:w="1134"/>
-            <w:shd w:val="clear" w:color="auto" w:fill="C0392B"/>
+            <w:shd w:val="clear" w:color="auto" w:fill="D68910"/>
           </w:tcPr>
           <w:p>
             <w:r>
@@ -295,7 +295,7 @@
               <w:rPr>
                 <w:sz w:val="19"/>
               </w:rPr>
-              <w:t>Alto</w:t>
+              <w:t>Medio</w:t>
             </w:r>
           </w:p>
         </w:tc>
@@ -312,56 +312,6 @@
                 <w:sz w:val="19"/>
               </w:rPr>
               <w:t>4</w:t>
-            </w:r>
-          </w:p>
-        </w:tc>
-        <w:tc>
-          <w:tcPr>
-            <w:tcW w:type="dxa" w:w="7370"/>
-          </w:tcPr>
-          <w:p>
-            <w:r/>
-            <w:r>
-              <w:rPr>
-                <w:sz w:val="19"/>
-              </w:rPr>
-              <w:t>No hay ningún cálculo resistente ni de estabilidad (3.4)</w:t>
-            </w:r>
-          </w:p>
-        </w:tc>
-        <w:tc>
-          <w:tcPr>
-            <w:tcW w:type="dxa" w:w="1134"/>
-            <w:shd w:val="clear" w:color="auto" w:fill="C0392B"/>
-          </w:tcPr>
-          <w:p>
-            <w:r>
-              <w:rPr>
-                <w:b/>
-                <w:color w:val="FFFFFF"/>
-              </w:rPr>
-            </w:r>
-            <w:r>
-              <w:rPr>
-                <w:sz w:val="19"/>
-              </w:rPr>
-              <w:t>Alto</w:t>
-            </w:r>
-          </w:p>
-        </w:tc>
-      </w:tr>
-      <w:tr>
-        <w:tc>
-          <w:tcPr>
-            <w:tcW w:type="dxa" w:w="567"/>
-          </w:tcPr>
-          <w:p>
-            <w:r/>
-            <w:r>
-              <w:rPr>
-                <w:sz w:val="19"/>
-              </w:rPr>
-              <w:t>5</w:t>
             </w:r>
           </w:p>
         </w:tc>
@@ -411,6 +361,56 @@
               <w:rPr>
                 <w:sz w:val="19"/>
               </w:rPr>
+              <w:t>5</w:t>
+            </w:r>
+          </w:p>
+        </w:tc>
+        <w:tc>
+          <w:tcPr>
+            <w:tcW w:type="dxa" w:w="7370"/>
+          </w:tcPr>
+          <w:p>
+            <w:r/>
+            <w:r>
+              <w:rPr>
+                <w:sz w:val="19"/>
+              </w:rPr>
+              <w:t>Hipótesis del ACV (4.1)</w:t>
+            </w:r>
+          </w:p>
+        </w:tc>
+        <w:tc>
+          <w:tcPr>
+            <w:tcW w:type="dxa" w:w="1134"/>
+            <w:shd w:val="clear" w:color="auto" w:fill="D68910"/>
+          </w:tcPr>
+          <w:p>
+            <w:r>
+              <w:rPr>
+                <w:b/>
+                <w:color w:val="FFFFFF"/>
+              </w:rPr>
+            </w:r>
+            <w:r>
+              <w:rPr>
+                <w:sz w:val="19"/>
+              </w:rPr>
+              <w:t>Medio</w:t>
+            </w:r>
+          </w:p>
+        </w:tc>
+      </w:tr>
+      <w:tr>
+        <w:tc>
+          <w:tcPr>
+            <w:tcW w:type="dxa" w:w="567"/>
+          </w:tcPr>
+          <w:p>
+            <w:r/>
+            <w:r>
+              <w:rPr>
+                <w:sz w:val="19"/>
+              </w:rPr>
               <w:t>6</w:t>
             </w:r>
           </w:p>
@@ -425,7 +425,7 @@
               <w:rPr>
                 <w:sz w:val="19"/>
               </w:rPr>
-              <w:t>La matriz de decisión es subjetiva (4.5)</w:t>
+              <w:t>No he tenido acceso al texto de la UNE-EN 14183 (2.4 y normativa)</w:t>
             </w:r>
           </w:p>
         </w:tc>
@@ -475,7 +475,7 @@
               <w:rPr>
                 <w:sz w:val="19"/>
               </w:rPr>
-              <w:t>Hipótesis del ACV (4.1)</w:t>
+              <w:t>Estudio de patentes no exhaustivo (2.5)</w:t>
             </w:r>
           </w:p>
         </w:tc>
@@ -525,7 +525,7 @@
               <w:rPr>
                 <w:sz w:val="19"/>
               </w:rPr>
-              <w:t>No he tenido acceso al texto de la UNE-EN 14183 (2.4 y normativa)</w:t>
+              <w:t>Altura de 0,48 m a partir de un alcance de 1,24 veces la estatura (1.3)</w:t>
             </w:r>
           </w:p>
         </w:tc>
@@ -575,7 +575,7 @@
               <w:rPr>
                 <w:sz w:val="19"/>
               </w:rPr>
-              <w:t>Estudio de patentes no exhaustivo (2.5)</w:t>
+              <w:t>Costes y márgenes inventados (2.1)</w:t>
             </w:r>
           </w:p>
         </w:tc>
@@ -625,14 +625,14 @@
               <w:rPr>
                 <w:sz w:val="19"/>
               </w:rPr>
-              <w:t>Altura de 0,48 m a partir de un alcance de 1,24 veces la estatura (1.3)</w:t>
+              <w:t>El ACV está en kg de CO₂ equivalente, no en Ecopuntos (ECO-it) (1. Enfoque general)</w:t>
             </w:r>
           </w:p>
         </w:tc>
         <w:tc>
           <w:tcPr>
             <w:tcW w:type="dxa" w:w="1134"/>
-            <w:shd w:val="clear" w:color="auto" w:fill="D68910"/>
+            <w:shd w:val="clear" w:color="auto" w:fill="7F8C8D"/>
           </w:tcPr>
           <w:p>
             <w:r>
@@ -645,7 +645,7 @@
               <w:rPr>
                 <w:sz w:val="19"/>
               </w:rPr>
-              <w:t>Medio</w:t>
+              <w:t>Bajo</w:t>
             </w:r>
           </w:p>
         </w:tc>
@@ -675,14 +675,14 @@
               <w:rPr>
                 <w:sz w:val="19"/>
               </w:rPr>
-              <w:t>Costes y márgenes inventados (2.1)</w:t>
+              <w:t>El AMFEC no calcula la criticidad (G × O) (5.2)</w:t>
             </w:r>
           </w:p>
         </w:tc>
         <w:tc>
           <w:tcPr>
             <w:tcW w:type="dxa" w:w="1134"/>
-            <w:shd w:val="clear" w:color="auto" w:fill="D68910"/>
+            <w:shd w:val="clear" w:color="auto" w:fill="7F8C8D"/>
           </w:tcPr>
           <w:p>
             <w:r>
@@ -695,7 +695,7 @@
               <w:rPr>
                 <w:sz w:val="19"/>
               </w:rPr>
-              <w:t>Medio</w:t>
+              <w:t>Bajo</w:t>
             </w:r>
           </w:p>
         </w:tc>
@@ -1016,7 +1016,7 @@
         <w:pStyle w:val="Heading2"/>
       </w:pPr>
       <w:r>
-        <w:t>1. El ACV está en kg de CO₂ equivalente, no en Ecopuntos (ECO-it)</w:t>
+        <w:t>1. Decisión final: aluminio reciclado (antes era la madera)</w:t>
       </w:r>
     </w:p>
     <w:p>
@@ -1028,16 +1028,16 @@
           <w:b/>
           <w:color w:val="FFFFFF"/>
           <w:sz w:val="17"/>
-          <w:shd w:val="clear" w:color="auto" w:fill="C0392B"/>
+          <w:shd w:val="clear" w:color="auto" w:fill="D68910"/>
         </w:rPr>
-        <w:t xml:space="preserve"> IMPACTO ALTO </w:t>
+        <w:t xml:space="preserve"> IMPACTO MEDIO </w:t>
       </w:r>
       <w:r>
         <w:rPr>
           <w:color w:val="6B7280"/>
           <w:sz w:val="18"/>
         </w:rPr>
-        <w:t xml:space="preserve">   Apartado: 1. Enfoque general</w:t>
+        <w:t xml:space="preserve">   Apartado: 4.5</w:t>
       </w:r>
     </w:p>
     <w:p>
@@ -1052,7 +1052,7 @@
         <w:t xml:space="preserve">Qué decidí: </w:t>
       </w:r>
       <w:r>
-        <w:t>Calcular solo la huella de carbono con factores de la base de datos ICE v2.0 (Universidad de Bath) y el módulo D de la norma EN 15804.</w:t>
+        <w:t>Aplicar primero un filtro de requisitos imprescindibles (Tabla 16). El acero y la madera no cumplen P5 y quedan descartados, así que se elige el aluminio reciclado.</w:t>
       </w:r>
     </w:p>
     <w:p>
@@ -1067,7 +1067,7 @@
         <w:t xml:space="preserve">Por qué: </w:t>
       </w:r>
       <w:r>
-        <w:t>No tenía acceso a ECO-it ni a su base de datos, y los kg de CO₂ se pueden calcular y justificar con fuentes públicas.</w:t>
+        <w:t>Otra revisión detectó que la versión anterior elegía la madera, que pesa 3,96 kg, y que la matriz le daba un 4 en peso. Con un 1 en peso ganaba el aluminio. Ahora la conclusión coincide con el modelo, los planos y el capítulo 5.</w:t>
       </w:r>
     </w:p>
     <w:p>
@@ -1082,7 +1082,7 @@
         <w:t xml:space="preserve">Qué duda me queda: </w:t>
       </w:r>
       <w:r>
-        <w:t>El temario de la asignatura menciona ECO-it y el Eco-indicador 99. Es muy posible que el profesor espere el ACV hecho con esa herramienta y en milipuntos. La huella de carbono es un indicador válido, pero solo mide el cambio climático; otros impactos (toxicidad, agotamiento de recursos) podrían cambiar el orden entre acero y aluminio.</w:t>
+        <w:t>La madera queda descartada por un peso calculado con una sección simplificada. Puede que un diseño de madera bien hecho también cumpla, pero no está demostrado.</w:t>
       </w:r>
     </w:p>
     <w:p>
@@ -1097,7 +1097,7 @@
         <w:t xml:space="preserve">Cómo comprobarlo: </w:t>
       </w:r>
       <w:r>
-        <w:t>Pregunta al profesor si acepta kg de CO₂-eq. Si no lo acepta, rehaz las tablas 12 a 14 con ECO-it usando las masas de la Tabla 10: las masas y las fases ya están, solo cambian los factores.</w:t>
+        <w:t>Si te preguntan por qué no la madera: incumple un requisito imprescindible y su modelo no está verificado. Queda como línea futura.</w:t>
       </w:r>
     </w:p>
     <w:p>
@@ -1110,7 +1110,7 @@
         <w:pStyle w:val="Heading2"/>
       </w:pPr>
       <w:r>
-        <w:t>2. La alternativa de madera usa la misma geometría que la metálica</w:t>
+        <w:t>2. Comprobaciones por cálculo manual</w:t>
       </w:r>
     </w:p>
     <w:p>
@@ -1122,16 +1122,16 @@
           <w:b/>
           <w:color w:val="FFFFFF"/>
           <w:sz w:val="17"/>
-          <w:shd w:val="clear" w:color="auto" w:fill="C0392B"/>
+          <w:shd w:val="clear" w:color="auto" w:fill="D68910"/>
         </w:rPr>
-        <w:t xml:space="preserve"> IMPACTO ALTO </w:t>
+        <w:t xml:space="preserve"> IMPACTO MEDIO </w:t>
       </w:r>
       <w:r>
         <w:rPr>
           <w:color w:val="6B7280"/>
           <w:sz w:val="18"/>
         </w:rPr>
-        <w:t xml:space="preserve">   Apartado: 4. Evaluación</w:t>
+        <w:t xml:space="preserve">   Apartado: 3.5</w:t>
       </w:r>
     </w:p>
     <w:p>
@@ -1146,7 +1146,7 @@
         <w:t xml:space="preserve">Qué decidí: </w:t>
       </w:r>
       <w:r>
-        <w:t>Modelar las tres alternativas con la misma forma y cambiar solo el material, macizando los perfiles en la madera.</w:t>
+        <w:t>Añadir el apartado 3.5 con cálculos sencillos: flexión y pandeo del larguero, plataforma, pasadores, vuelco y mecanismo.</w:t>
       </w:r>
     </w:p>
     <w:p>
@@ -1161,7 +1161,7 @@
         <w:t xml:space="preserve">Por qué: </w:t>
       </w:r>
       <w:r>
-        <w:t>Así la comparación del ACV es directa: la única variable es el material.</w:t>
+        <w:t>No había ninguna comprobación de P1, P2 ni R3.</w:t>
       </w:r>
     </w:p>
     <w:p>
@@ -1176,7 +1176,7 @@
         <w:t xml:space="preserve">Qué duda me queda: </w:t>
       </w:r>
       <w:r>
-        <w:t>Un listón de haya macizo de 40 × 20 mm es demasiado esbelto para 150 kg. Una escalera de madera real tendría largueros de unos 20 × 60 mm o más, así que pesaría más de los 3,96 kg calculados y emitiría algo más. La conclusión de que la madera es la mejor opción (Tabla 15) se basa en un peso que probablemente es optimista.</w:t>
+        <w:t>Los cálculos son simplificados (viga biapoyada, carga estática de 150 kg, coeficiente de seguridad de 2) y no sustituyen a un estudio por elementos finitos ni a los ensayos de la norma. La plataforma y el peldaño cumplen por poco (coeficiente de seguridad 2,0) y el peso final estimado (3,46 kg) apenas cumple P5. Los nervios no están dibujados en el modelo ni en los planos.</w:t>
       </w:r>
     </w:p>
     <w:p>
@@ -1191,7 +1191,7 @@
         <w:t xml:space="preserve">Cómo comprobarlo: </w:t>
       </w:r>
       <w:r>
-        <w:t>Haz un cálculo rápido a flexión del larguero con 150 kg (o un estudio en SolidWorks Simulation) para cada material y ajusta la sección antes de comparar. Si la madera supera claramente los 3,5 kg, la decisión se inclina hacia el aluminio reciclado.</w:t>
+        <w:t>Si quieres reforzarlo, haz un estudio estático de la plataforma en SolidWorks Simulation.</w:t>
       </w:r>
     </w:p>
     <w:p>
@@ -1204,7 +1204,7 @@
         <w:pStyle w:val="Heading2"/>
       </w:pPr>
       <w:r>
-        <w:t>3. El taburete modelado no tiene ningún bloqueo en posición abierta</w:t>
+        <w:t>3. El pestillo está dimensionado pero no modelado</w:t>
       </w:r>
     </w:p>
     <w:p>
@@ -1216,16 +1216,16 @@
           <w:b/>
           <w:color w:val="FFFFFF"/>
           <w:sz w:val="17"/>
-          <w:shd w:val="clear" w:color="auto" w:fill="C0392B"/>
+          <w:shd w:val="clear" w:color="auto" w:fill="D68910"/>
         </w:rPr>
-        <w:t xml:space="preserve"> IMPACTO ALTO </w:t>
+        <w:t xml:space="preserve"> IMPACTO MEDIO </w:t>
       </w:r>
       <w:r>
         <w:rPr>
           <w:color w:val="6B7280"/>
           <w:sz w:val="18"/>
         </w:rPr>
-        <w:t xml:space="preserve">   Apartado: 3.4 y 5.2</w:t>
+        <w:t xml:space="preserve">   Apartado: 3.5 y 5.2</w:t>
       </w:r>
     </w:p>
     <w:p>
@@ -1240,7 +1240,7 @@
         <w:t xml:space="preserve">Qué decidí: </w:t>
       </w:r>
       <w:r>
-        <w:t>Dejar el pestillo de seguridad sin modelar y proponerlo como acción del AMFEC.</w:t>
+        <w:t>Calcular con el modelo cinemático cómo actúa el peso del usuario y dimensionar el pestillo en la articulación del peldaño.</w:t>
       </w:r>
     </w:p>
     <w:p>
@@ -1255,7 +1255,7 @@
         <w:t xml:space="preserve">Por qué: </w:t>
       </w:r>
       <w:r>
-        <w:t>El mecanismo de plegado ya era bastante complejo y quería asegurar primero que se plegaba sin interferencias.</w:t>
+        <w:t>El cálculo demuestra que el peso sobre el peldaño tiende a cerrar el taburete, así que el pestillo es imprescindible.</w:t>
       </w:r>
     </w:p>
     <w:p>
@@ -1270,7 +1270,7 @@
         <w:t xml:space="preserve">Qué duda me queda: </w:t>
       </w:r>
       <w:r>
-        <w:t>El mecanismo tiene un solo grado de libertad: sin pestillo, lo único que lo mantendría abierto sería el rozamiento. En el TRIZ (contradicción tercera) digo que el tirante queda «pasado de su punto muerto» y se autobloquea con la carga, pero en el rediseño del apartado 3.4 no he comprobado que eso ocurra con la geometría final. Es el punto técnico más débil del trabajo y el primero que puede preguntar un profesor de mecánica.</w:t>
+        <w:t>El pestillo sigue sin estar en el modelo 3D ni en los planos.</w:t>
       </w:r>
     </w:p>
     <w:p>
@@ -1285,7 +1285,7 @@
         <w:t xml:space="preserve">Cómo comprobarlo: </w:t>
       </w:r>
       <w:r>
-        <w:t>Si hay tiempo, modela un pasador con muelle en la articulación de la plataforma. Si no, ten preparada la explicación: un grado de libertad, se bloquea una articulación y se retira el pasador para plegar.</w:t>
+        <w:t>Explícalo como diseño de detalle pendiente. Los números (522 N·m y unos 710 N por pasador) están en la Tabla 11.</w:t>
       </w:r>
     </w:p>
     <w:p>
@@ -1298,101 +1298,7 @@
         <w:pStyle w:val="Heading2"/>
       </w:pPr>
       <w:r>
-        <w:t>4. No hay ningún cálculo resistente ni de estabilidad</w:t>
-      </w:r>
-    </w:p>
-    <w:p>
-      <w:pPr>
-        <w:spacing w:after="80"/>
-      </w:pPr>
-      <w:r>
-        <w:rPr>
-          <w:b/>
-          <w:color w:val="FFFFFF"/>
-          <w:sz w:val="17"/>
-          <w:shd w:val="clear" w:color="auto" w:fill="C0392B"/>
-        </w:rPr>
-        <w:t xml:space="preserve"> IMPACTO ALTO </w:t>
-      </w:r>
-      <w:r>
-        <w:rPr>
-          <w:color w:val="6B7280"/>
-          <w:sz w:val="18"/>
-        </w:rPr>
-        <w:t xml:space="preserve">   Apartado: 3.4</w:t>
-      </w:r>
-    </w:p>
-    <w:p>
-      <w:pPr>
-        <w:spacing w:after="60"/>
-      </w:pPr>
-      <w:r>
-        <w:rPr>
-          <w:b/>
-          <w:color w:val="1F2A36"/>
-        </w:rPr>
-        <w:t xml:space="preserve">Qué decidí: </w:t>
-      </w:r>
-      <w:r>
-        <w:t>Tomar las secciones (tubo de 40 × 20 × 2, pletinas de 20 × 4, pasadores de Ø 8 y plataforma de PP de 3 mm) por comparación con productos del mercado.</w:t>
-      </w:r>
-    </w:p>
-    <w:p>
-      <w:pPr>
-        <w:spacing w:after="60"/>
-      </w:pPr>
-      <w:r>
-        <w:rPr>
-          <w:b/>
-          <w:color w:val="1F2A36"/>
-        </w:rPr>
-        <w:t xml:space="preserve">Por qué: </w:t>
-      </w:r>
-      <w:r>
-        <w:t>La asignatura no pide cálculo estructural y las prácticas de Simulation son opcionales.</w:t>
-      </w:r>
-    </w:p>
-    <w:p>
-      <w:pPr>
-        <w:spacing w:after="60"/>
-      </w:pPr>
-      <w:r>
-        <w:rPr>
-          <w:b/>
-          <w:color w:val="1F2A36"/>
-        </w:rPr>
-        <w:t xml:space="preserve">Qué duda me queda: </w:t>
-      </w:r>
-      <w:r>
-        <w:t>No sé si la plataforma de PP de 3 mm, con 350 mm de luz y sin nervios, aguanta 150 kg: casi seguro que no sin nervios. Tampoco he comprobado a cortante los pasadores ni el vuelco lateral con el ensayo de la UNE-EN 14183. En la Tabla 2 (P1 y P2) digo que se superarán los ensayos, pero no está demostrado.</w:t>
-      </w:r>
-    </w:p>
-    <w:p>
-      <w:pPr>
-        <w:spacing w:after="60"/>
-      </w:pPr>
-      <w:r>
-        <w:rPr>
-          <w:b/>
-          <w:color w:val="1F2A36"/>
-        </w:rPr>
-        <w:t xml:space="preserve">Cómo comprobarlo: </w:t>
-      </w:r>
-      <w:r>
-        <w:t>Lo ideal es un estudio estático en SolidWorks Simulation de la plataforma y del larguero con 150 kg (hay una práctica de viga en voladizo que sirve de guía). Como mínimo, menciona en la defensa que es la siguiente fase del diseño de detalle.</w:t>
-      </w:r>
-    </w:p>
-    <w:p>
-      <w:pPr>
-        <w:spacing w:after="80"/>
-      </w:pPr>
-    </w:p>
-    <w:p>
-      <w:pPr>
-        <w:pStyle w:val="Heading2"/>
-      </w:pPr>
-      <w:r>
-        <w:t>5. He añadido un capítulo 5 (QFD, AMFEC y análisis del valor) que no está en el índice del profesor</w:t>
+        <w:t>4. He añadido un capítulo 5 (QFD, AMFEC y análisis del valor) que no está en el índice del profesor</w:t>
       </w:r>
     </w:p>
     <w:p>
@@ -1486,101 +1392,7 @@
         <w:pStyle w:val="Heading2"/>
       </w:pPr>
       <w:r>
-        <w:t>6. La matriz de decisión es subjetiva</w:t>
-      </w:r>
-    </w:p>
-    <w:p>
-      <w:pPr>
-        <w:spacing w:after="80"/>
-      </w:pPr>
-      <w:r>
-        <w:rPr>
-          <w:b/>
-          <w:color w:val="FFFFFF"/>
-          <w:sz w:val="17"/>
-          <w:shd w:val="clear" w:color="auto" w:fill="D68910"/>
-        </w:rPr>
-        <w:t xml:space="preserve"> IMPACTO MEDIO </w:t>
-      </w:r>
-      <w:r>
-        <w:rPr>
-          <w:color w:val="6B7280"/>
-          <w:sz w:val="18"/>
-        </w:rPr>
-        <w:t xml:space="preserve">   Apartado: 4.5</w:t>
-      </w:r>
-    </w:p>
-    <w:p>
-      <w:pPr>
-        <w:spacing w:after="60"/>
-      </w:pPr>
-      <w:r>
-        <w:rPr>
-          <w:b/>
-          <w:color w:val="1F2A36"/>
-        </w:rPr>
-        <w:t xml:space="preserve">Qué decidí: </w:t>
-      </w:r>
-      <w:r>
-        <w:t>Pesos de 30 / 25 / 20 / 15 / 10 % y puntuaciones de 1 a 5 puestas por mí.</w:t>
-      </w:r>
-    </w:p>
-    <w:p>
-      <w:pPr>
-        <w:spacing w:after="60"/>
-      </w:pPr>
-      <w:r>
-        <w:rPr>
-          <w:b/>
-          <w:color w:val="1F2A36"/>
-        </w:rPr>
-        <w:t xml:space="preserve">Por qué: </w:t>
-      </w:r>
-      <w:r>
-        <w:t>Es lo habitual en una matriz ponderada y los pesos siguen la importancia del EDP.</w:t>
-      </w:r>
-    </w:p>
-    <w:p>
-      <w:pPr>
-        <w:spacing w:after="60"/>
-      </w:pPr>
-      <w:r>
-        <w:rPr>
-          <w:b/>
-          <w:color w:val="1F2A36"/>
-        </w:rPr>
-        <w:t xml:space="preserve">Qué duda me queda: </w:t>
-      </w:r>
-      <w:r>
-        <w:t>A la madera le doy un 4 en peso aunque no cumple P5 (3,96 kg &gt; 3,5 kg). Si le pusiera un 3 y además el peso valiera un 35 % y la huella un 20 %, ganaría el aluminio (3,70 frente a 3,45). Las notas de coste, durabilidad y estética no salen de ningún dato.</w:t>
-      </w:r>
-    </w:p>
-    <w:p>
-      <w:pPr>
-        <w:spacing w:after="60"/>
-      </w:pPr>
-      <w:r>
-        <w:rPr>
-          <w:b/>
-          <w:color w:val="1F2A36"/>
-        </w:rPr>
-        <w:t xml:space="preserve">Cómo comprobarlo: </w:t>
-      </w:r>
-      <w:r>
-        <w:t>En la defensa, explica que la decisión es sensible a los pesos y que por eso se mantiene el aluminio reciclado como alternativa. Si quieres, añade un análisis de sensibilidad (dos o tres combinaciones de pesos).</w:t>
-      </w:r>
-    </w:p>
-    <w:p>
-      <w:pPr>
-        <w:spacing w:after="80"/>
-      </w:pPr>
-    </w:p>
-    <w:p>
-      <w:pPr>
-        <w:pStyle w:val="Heading2"/>
-      </w:pPr>
-      <w:r>
-        <w:t>7. Hipótesis del ACV</w:t>
+        <w:t>5. Hipótesis del ACV</w:t>
       </w:r>
     </w:p>
     <w:p>
@@ -1674,7 +1486,7 @@
         <w:pStyle w:val="Heading2"/>
       </w:pPr>
       <w:r>
-        <w:t>8. No he tenido acceso al texto de la UNE-EN 14183</w:t>
+        <w:t>6. No he tenido acceso al texto de la UNE-EN 14183</w:t>
       </w:r>
     </w:p>
     <w:p>
@@ -1768,7 +1580,7 @@
         <w:pStyle w:val="Heading2"/>
       </w:pPr>
       <w:r>
-        <w:t>9. Estudio de patentes no exhaustivo</w:t>
+        <w:t>7. Estudio de patentes no exhaustivo</w:t>
       </w:r>
     </w:p>
     <w:p>
@@ -1862,7 +1674,7 @@
         <w:pStyle w:val="Heading2"/>
       </w:pPr>
       <w:r>
-        <w:t>10. Altura de 0,48 m a partir de un alcance de 1,24 veces la estatura</w:t>
+        <w:t>8. Altura de 0,48 m a partir de un alcance de 1,24 veces la estatura</w:t>
       </w:r>
     </w:p>
     <w:p>
@@ -1956,7 +1768,7 @@
         <w:pStyle w:val="Heading2"/>
       </w:pPr>
       <w:r>
-        <w:t>11. Costes y márgenes inventados</w:t>
+        <w:t>9. Costes y márgenes inventados</w:t>
       </w:r>
     </w:p>
     <w:p>
@@ -2050,6 +1862,194 @@
         <w:pStyle w:val="Heading2"/>
       </w:pPr>
       <w:r>
+        <w:t>10. El ACV está en kg de CO₂ equivalente, no en Ecopuntos (ECO-it)</w:t>
+      </w:r>
+    </w:p>
+    <w:p>
+      <w:pPr>
+        <w:spacing w:after="80"/>
+      </w:pPr>
+      <w:r>
+        <w:rPr>
+          <w:b/>
+          <w:color w:val="FFFFFF"/>
+          <w:sz w:val="17"/>
+          <w:shd w:val="clear" w:color="auto" w:fill="7F8C8D"/>
+        </w:rPr>
+        <w:t xml:space="preserve"> IMPACTO BAJO </w:t>
+      </w:r>
+      <w:r>
+        <w:rPr>
+          <w:color w:val="6B7280"/>
+          <w:sz w:val="18"/>
+        </w:rPr>
+        <w:t xml:space="preserve">   Apartado: 1. Enfoque general</w:t>
+      </w:r>
+    </w:p>
+    <w:p>
+      <w:pPr>
+        <w:spacing w:after="60"/>
+      </w:pPr>
+      <w:r>
+        <w:rPr>
+          <w:b/>
+          <w:color w:val="1F2A36"/>
+        </w:rPr>
+        <w:t xml:space="preserve">Qué decidí: </w:t>
+      </w:r>
+      <w:r>
+        <w:t>Calcular la huella de carbono con factores de la base de datos ICE v2.0 y el módulo D de la norma EN 15804.</w:t>
+      </w:r>
+    </w:p>
+    <w:p>
+      <w:pPr>
+        <w:spacing w:after="60"/>
+      </w:pPr>
+      <w:r>
+        <w:rPr>
+          <w:b/>
+          <w:color w:val="1F2A36"/>
+        </w:rPr>
+        <w:t xml:space="preserve">Por qué: </w:t>
+      </w:r>
+      <w:r>
+        <w:t>El índice de ejemplo del profesor evalúa en «kg CO₂-eq por componente en la fase de producción, uso y eliminación», el mismo formato.</w:t>
+      </w:r>
+    </w:p>
+    <w:p>
+      <w:pPr>
+        <w:spacing w:after="60"/>
+      </w:pPr>
+      <w:r>
+        <w:rPr>
+          <w:b/>
+          <w:color w:val="1F2A36"/>
+        </w:rPr>
+        <w:t xml:space="preserve">Qué duda me queda: </w:t>
+      </w:r>
+      <w:r>
+        <w:t>Resuelta en gran parte: el formato coincide con el del ejemplo. Solo queda la duda de si el profesor espera que se use ECO-it como herramienta.</w:t>
+      </w:r>
+    </w:p>
+    <w:p>
+      <w:pPr>
+        <w:spacing w:after="60"/>
+      </w:pPr>
+      <w:r>
+        <w:rPr>
+          <w:b/>
+          <w:color w:val="1F2A36"/>
+        </w:rPr>
+        <w:t xml:space="preserve">Cómo comprobarlo: </w:t>
+      </w:r>
+      <w:r>
+        <w:t>Nada obligatorio. Si en clase se usó ECO-it, puedes comprobar uno de los resultados con él.</w:t>
+      </w:r>
+    </w:p>
+    <w:p>
+      <w:pPr>
+        <w:spacing w:after="80"/>
+      </w:pPr>
+    </w:p>
+    <w:p>
+      <w:pPr>
+        <w:pStyle w:val="Heading2"/>
+      </w:pPr>
+      <w:r>
+        <w:t>11. El AMFEC no calcula la criticidad (G × O)</w:t>
+      </w:r>
+    </w:p>
+    <w:p>
+      <w:pPr>
+        <w:spacing w:after="80"/>
+      </w:pPr>
+      <w:r>
+        <w:rPr>
+          <w:b/>
+          <w:color w:val="FFFFFF"/>
+          <w:sz w:val="17"/>
+          <w:shd w:val="clear" w:color="auto" w:fill="7F8C8D"/>
+        </w:rPr>
+        <w:t xml:space="preserve"> IMPACTO BAJO </w:t>
+      </w:r>
+      <w:r>
+        <w:rPr>
+          <w:color w:val="6B7280"/>
+          <w:sz w:val="18"/>
+        </w:rPr>
+        <w:t xml:space="preserve">   Apartado: 5.2</w:t>
+      </w:r>
+    </w:p>
+    <w:p>
+      <w:pPr>
+        <w:spacing w:after="60"/>
+      </w:pPr>
+      <w:r>
+        <w:rPr>
+          <w:b/>
+          <w:color w:val="1F2A36"/>
+        </w:rPr>
+        <w:t xml:space="preserve">Qué decidí: </w:t>
+      </w:r>
+      <w:r>
+        <w:t>Usar solo el IPR = O × G × D.</w:t>
+      </w:r>
+    </w:p>
+    <w:p>
+      <w:pPr>
+        <w:spacing w:after="60"/>
+      </w:pPr>
+      <w:r>
+        <w:rPr>
+          <w:b/>
+          <w:color w:val="1F2A36"/>
+        </w:rPr>
+        <w:t xml:space="preserve">Por qué: </w:t>
+      </w:r>
+      <w:r>
+        <w:t>Es lo único que definen los apuntes de Técnicas de rediseño; la palabra «criticidades» solo aparece en el nombre de la técnica.</w:t>
+      </w:r>
+    </w:p>
+    <w:p>
+      <w:pPr>
+        <w:spacing w:after="60"/>
+      </w:pPr>
+      <w:r>
+        <w:rPr>
+          <w:b/>
+          <w:color w:val="1F2A36"/>
+        </w:rPr>
+        <w:t xml:space="preserve">Qué duda me queda: </w:t>
+      </w:r>
+      <w:r>
+        <w:t>Otra revisión lo señaló como fallo. Según tus apuntes no lo es, pero algunos profesores lo piden.</w:t>
+      </w:r>
+    </w:p>
+    <w:p>
+      <w:pPr>
+        <w:spacing w:after="60"/>
+      </w:pPr>
+      <w:r>
+        <w:rPr>
+          <w:b/>
+          <w:color w:val="1F2A36"/>
+        </w:rPr>
+        <w:t xml:space="preserve">Cómo comprobarlo: </w:t>
+      </w:r>
+      <w:r>
+        <w:t>Si quieres cubrirte, añade una columna G × O a la Tabla 17. Son 8 multiplicaciones.</w:t>
+      </w:r>
+    </w:p>
+    <w:p>
+      <w:pPr>
+        <w:spacing w:after="80"/>
+      </w:pPr>
+    </w:p>
+    <w:p>
+      <w:pPr>
+        <w:pStyle w:val="Heading2"/>
+      </w:pPr>
+      <w:r>
         <w:t>12. Elección de parámetros TRIZ</w:t>
       </w:r>
     </w:p>
@@ -2626,7 +2626,7 @@
           <w:b w:val="0"/>
           <w:i w:val="0"/>
         </w:rPr>
-        <w:t>Las dudas de impacto alto (1 a 4) son las que un profesor de Ingeniería Mecánica puede ver con más facilidad. No hace falta resolverlas todas; basta con que las conozcas y sepas explicar por qué se tomó esa decisión y cuál sería el siguiente paso. Decir «esto no está verificado y se comprobaría así» suele puntuar mejor que dar un dato que luego no sabes justificar.</w:t>
+        <w:t>Las dudas de impacto medio son las que un profesor de Ingeniería Mecánica puede ver con más facilidad. No hace falta resolverlas todas; basta con que las conozcas y sepas explicar por qué se tomó esa decisión y cuál sería el siguiente paso. Decir «esto no está verificado y se comprobaría así» suele puntuar mejor que dar un dato que luego no sabes justificar.</w:t>
       </w:r>
     </w:p>
     <w:p>

</xml_diff>